<commit_message>
Reconcile docs with the as-built system
HLD.md v1.0: as-built/target markers throughout, module additions (U,
stage system, fund depth), ledger/rules/migration reality, security and
deployment status, ADR-8..10 (IST clock, stage disclosure, on-read
projections), and a section 16 as-built addendum mapping the codebase.
Refresh apps/api README and DEPLOYMENT current-state to v1.3 / 174 tests.

Co-Authored-By: Claude Fable 5 <noreply@anthropic.com>
</commit_message>
<xml_diff>
--- a/HLD.docx
+++ b/HLD.docx
@@ -44,7 +44,7 @@
         </w:p>
       </w:sdtContent>
     </w:sdt>
-    <w:bookmarkStart w:id="44" w:name="paper--high-level-design-hld"/>
+    <w:bookmarkStart w:id="46" w:name="paper--high-level-design-hld"/>
     <w:p>
       <w:pPr>
         <w:pStyle w:val="Heading1"/>
@@ -70,7 +70,23 @@
         <w:pStyle w:val="BodyText"/>
       </w:pPr>
       <w:r>
-        <w:t xml:space="preserve">Status: Draft v0.1 · Date: 2026-06-25 · Companion to:</w:t>
+        <w:t xml:space="preserve">Status:</w:t>
+      </w:r>
+      <w:r>
+        <w:t xml:space="preserve"> </w:t>
+      </w:r>
+      <w:r>
+        <w:rPr>
+          <w:b/>
+          <w:bCs/>
+        </w:rPr>
+        <w:t xml:space="preserve">v1.0 (as-built reconciliation)</w:t>
+      </w:r>
+      <w:r>
+        <w:t xml:space="preserve"> </w:t>
+      </w:r>
+      <w:r>
+        <w:t xml:space="preserve">· Date: 2026-07-14 · Supersedes: Draft v0.1 (2026-06-25) · Companion to:</w:t>
       </w:r>
       <w:r>
         <w:t xml:space="preserve"> </w:t>
@@ -80,6 +96,88 @@
           <w:rStyle w:val="VerbatimChar"/>
         </w:rPr>
         <w:t xml:space="preserve">REQUIREMENTS.md</w:t>
+      </w:r>
+      <w:r>
+        <w:t xml:space="preserve"> </w:t>
+      </w:r>
+      <w:r>
+        <w:t xml:space="preserve">(v1.3),</w:t>
+      </w:r>
+      <w:r>
+        <w:t xml:space="preserve"> </w:t>
+      </w:r>
+      <w:r>
+        <w:rPr>
+          <w:rStyle w:val="VerbatimChar"/>
+        </w:rPr>
+        <w:t xml:space="preserve">DEPLOYMENT.md</w:t>
+      </w:r>
+    </w:p>
+    <w:p>
+      <w:pPr>
+        <w:pStyle w:val="BlockText"/>
+      </w:pPr>
+      <w:r>
+        <w:t xml:space="preserve">v1.0 reconciles the design against the working system (</w:t>
+      </w:r>
+      <w:r>
+        <w:rPr>
+          <w:rStyle w:val="VerbatimChar"/>
+        </w:rPr>
+        <w:t xml:space="preserve">apps/api</w:t>
+      </w:r>
+      <w:r>
+        <w:t xml:space="preserve"> </w:t>
+      </w:r>
+      <w:r>
+        <w:t xml:space="preserve">FastAPI backend, 174 tests;</w:t>
+      </w:r>
+      <w:r>
+        <w:t xml:space="preserve"> </w:t>
+      </w:r>
+      <w:r>
+        <w:rPr>
+          <w:rStyle w:val="VerbatimChar"/>
+        </w:rPr>
+        <w:t xml:space="preserve">apps/web</w:t>
+      </w:r>
+      <w:r>
+        <w:t xml:space="preserve"> </w:t>
+      </w:r>
+      <w:r>
+        <w:t xml:space="preserve">React SPA). Sections keep the target architecture and mark</w:t>
+      </w:r>
+      <w:r>
+        <w:t xml:space="preserve"> </w:t>
+      </w:r>
+      <w:r>
+        <w:rPr>
+          <w:b/>
+          <w:bCs/>
+        </w:rPr>
+        <w:t xml:space="preserve">[As built]</w:t>
+      </w:r>
+      <w:r>
+        <w:t xml:space="preserve"> </w:t>
+      </w:r>
+      <w:r>
+        <w:t xml:space="preserve">where the implementation exists today and</w:t>
+      </w:r>
+      <w:r>
+        <w:t xml:space="preserve"> </w:t>
+      </w:r>
+      <w:r>
+        <w:rPr>
+          <w:b/>
+          <w:bCs/>
+        </w:rPr>
+        <w:t xml:space="preserve">[Target]</w:t>
+      </w:r>
+      <w:r>
+        <w:t xml:space="preserve"> </w:t>
+      </w:r>
+      <w:r>
+        <w:t xml:space="preserve">where the design awaits deployment or credentials. §16 is the as-built addendum.</w:t>
       </w:r>
     </w:p>
     <w:p>
@@ -222,7 +320,35 @@
         <w:t xml:space="preserve"> </w:t>
       </w:r>
       <w:r>
-        <w:t xml:space="preserve">— across the 20 functional modules (A–T) and the non-functional requirements. Low-level schema DDL, API contracts per endpoint, and UI wireframes are out of scope (deferred to LLD/API spec/design files).</w:t>
+        <w:t xml:space="preserve">— across the</w:t>
+      </w:r>
+      <w:r>
+        <w:t xml:space="preserve"> </w:t>
+      </w:r>
+      <w:r>
+        <w:rPr>
+          <w:b/>
+          <w:bCs/>
+        </w:rPr>
+        <w:t xml:space="preserve">21 functional modules (A–U)</w:t>
+      </w:r>
+      <w:r>
+        <w:t xml:space="preserve"> </w:t>
+      </w:r>
+      <w:r>
+        <w:t xml:space="preserve">and the non-functional requirements. Low-level schema DDL, API contracts per endpoint, and UI wireframes are out of scope (the OpenAPI spec is generated by the running service at</w:t>
+      </w:r>
+      <w:r>
+        <w:t xml:space="preserve"> </w:t>
+      </w:r>
+      <w:r>
+        <w:rPr>
+          <w:rStyle w:val="VerbatimChar"/>
+        </w:rPr>
+        <w:t xml:space="preserve">/docs</w:t>
+      </w:r>
+      <w:r>
+        <w:t xml:space="preserve">).</w:t>
       </w:r>
     </w:p>
     <w:bookmarkEnd w:id="10"/>
@@ -393,6 +519,38 @@
       <w:r>
         <w:t xml:space="preserve">via GitHub Actions + Workload Identity Federation — consistent with the org's other platforms.</w:t>
       </w:r>
+      <w:r>
+        <w:t xml:space="preserve"> </w:t>
+      </w:r>
+      <w:r>
+        <w:rPr>
+          <w:i/>
+          <w:iCs/>
+        </w:rPr>
+        <w:t xml:space="preserve">[Target — deployment deferred until Cloud SQL exists; plan in</w:t>
+      </w:r>
+      <w:r>
+        <w:rPr>
+          <w:i/>
+          <w:iCs/>
+        </w:rPr>
+        <w:t xml:space="preserve"> </w:t>
+      </w:r>
+      <w:r>
+        <w:rPr>
+          <w:rStyle w:val="VerbatimChar"/>
+          <w:i/>
+          <w:iCs/>
+        </w:rPr>
+        <w:t xml:space="preserve">DEPLOYMENT.md</w:t>
+      </w:r>
+      <w:r>
+        <w:rPr>
+          <w:i/>
+          <w:iCs/>
+        </w:rPr>
+        <w:t xml:space="preserve">.]</w:t>
+      </w:r>
     </w:p>
     <w:p>
       <w:pPr>
@@ -450,6 +608,38 @@
       <w:r>
         <w:t xml:space="preserve">, matching the org's existing apps.</w:t>
       </w:r>
+      <w:r>
+        <w:t xml:space="preserve"> </w:t>
+      </w:r>
+      <w:r>
+        <w:rPr>
+          <w:i/>
+          <w:iCs/>
+        </w:rPr>
+        <w:t xml:space="preserve">[As built — dev runs on SQLite via</w:t>
+      </w:r>
+      <w:r>
+        <w:rPr>
+          <w:i/>
+          <w:iCs/>
+        </w:rPr>
+        <w:t xml:space="preserve"> </w:t>
+      </w:r>
+      <w:r>
+        <w:rPr>
+          <w:rStyle w:val="VerbatimChar"/>
+          <w:i/>
+          <w:iCs/>
+        </w:rPr>
+        <w:t xml:space="preserve">PAPER_DATABASE_URL</w:t>
+      </w:r>
+      <w:r>
+        <w:rPr>
+          <w:i/>
+          <w:iCs/>
+        </w:rPr>
+        <w:t xml:space="preserve">; the app is Postgres-ready and Alembic-migrated.]</w:t>
+      </w:r>
     </w:p>
     <w:p>
       <w:pPr>
@@ -478,6 +668,16 @@
       <w:r>
         <w:t xml:space="preserve">statutory filings; licensed professionals (CS/CA/merchant banker) review and file where law requires. Paper is not itself a regulated intermediary, payment gateway, or RTA.</w:t>
       </w:r>
+      <w:r>
+        <w:t xml:space="preserve"> </w:t>
+      </w:r>
+      <w:r>
+        <w:rPr>
+          <w:i/>
+          <w:iCs/>
+        </w:rPr>
+        <w:t xml:space="preserve">[As built.]</w:t>
+      </w:r>
     </w:p>
     <w:p>
       <w:pPr>
@@ -488,7 +688,33 @@
         </w:numPr>
       </w:pPr>
       <w:r>
-        <w:t xml:space="preserve">India-first: data residency in India, INR base currency, English-first UI.</w:t>
+        <w:t xml:space="preserve">India-first: data residency in India, INR base currency, English-first UI, and a</w:t>
+      </w:r>
+      <w:r>
+        <w:t xml:space="preserve"> </w:t>
+      </w:r>
+      <w:r>
+        <w:rPr>
+          <w:b/>
+          <w:bCs/>
+        </w:rPr>
+        <w:t xml:space="preserve">uniform IST platform clock</w:t>
+      </w:r>
+      <w:r>
+        <w:t xml:space="preserve"> </w:t>
+      </w:r>
+      <w:r>
+        <w:t xml:space="preserve">for every recorded time (NFR-13).</w:t>
+      </w:r>
+      <w:r>
+        <w:t xml:space="preserve"> </w:t>
+      </w:r>
+      <w:r>
+        <w:rPr>
+          <w:i/>
+          <w:iCs/>
+        </w:rPr>
+        <w:t xml:space="preserve">[As built.]</w:t>
       </w:r>
     </w:p>
     <w:p>
@@ -517,6 +743,16 @@
       </w:r>
       <w:r>
         <w:t xml:space="preserve">specialist providers for e-sign, KYC, payments, valuation and demat rather than building them.</w:t>
+      </w:r>
+      <w:r>
+        <w:t xml:space="preserve"> </w:t>
+      </w:r>
+      <w:r>
+        <w:rPr>
+          <w:i/>
+          <w:iCs/>
+        </w:rPr>
+        <w:t xml:space="preserve">[Target — lifecycle logic is built; provider adapters await credentials; e-sign is simulated end-to-end.]</w:t>
       </w:r>
     </w:p>
     <w:p>
@@ -1319,6 +1555,53 @@
       </w:pPr>
       <w:r>
         <w:t xml:space="preserve">Each requirement module maps to a backend bounded context. Cross-cutting modules (N, M, T) are platform services every domain consumes.</w:t>
+      </w:r>
+      <w:r>
+        <w:t xml:space="preserve"> </w:t>
+      </w:r>
+      <w:r>
+        <w:rPr>
+          <w:b/>
+          <w:bCs/>
+        </w:rPr>
+        <w:t xml:space="preserve">[As built]</w:t>
+      </w:r>
+      <w:r>
+        <w:t xml:space="preserve"> </w:t>
+      </w:r>
+      <w:r>
+        <w:t xml:space="preserve">All 21 contexts below exist under</w:t>
+      </w:r>
+      <w:r>
+        <w:t xml:space="preserve"> </w:t>
+      </w:r>
+      <w:r>
+        <w:rPr>
+          <w:rStyle w:val="VerbatimChar"/>
+        </w:rPr>
+        <w:t xml:space="preserve">apps/api/app/</w:t>
+      </w:r>
+      <w:r>
+        <w:t xml:space="preserve"> </w:t>
+      </w:r>
+      <w:r>
+        <w:t xml:space="preserve">(models + services + routes per context; 71 tables), plus module</w:t>
+      </w:r>
+      <w:r>
+        <w:t xml:space="preserve"> </w:t>
+      </w:r>
+      <w:r>
+        <w:rPr>
+          <w:b/>
+          <w:bCs/>
+        </w:rPr>
+        <w:t xml:space="preserve">U (Finance)</w:t>
+      </w:r>
+      <w:r>
+        <w:t xml:space="preserve"> </w:t>
+      </w:r>
+      <w:r>
+        <w:t xml:space="preserve">added in v1.0 of the requirements — runway/burn snapshots consumed by dashboards and the stage guide.</w:t>
       </w:r>
     </w:p>
     <w:tbl>
@@ -2390,7 +2673,17 @@
               <w:pStyle w:val="Compact"/>
             </w:pPr>
             <w:r>
-              <w:t xml:space="preserve">Workspaces, file cabinet, dashboards, tax records, reports</w:t>
+              <w:t xml:space="preserve">Workspaces, file cabinet, dashboards, tax records, reports,</w:t>
+            </w:r>
+            <w:r>
+              <w:t xml:space="preserve"> </w:t>
+            </w:r>
+            <w:r>
+              <w:rPr>
+                <w:b/>
+                <w:bCs/>
+              </w:rPr>
+              <w:t xml:space="preserve">stage-guided workspace</w:t>
             </w:r>
           </w:p>
         </w:tc>
@@ -2402,11 +2695,220 @@
             </w:pPr>
             <w:r>
               <w:t xml:space="preserve">all</w:t>
+            </w:r>
+          </w:p>
+        </w:tc>
+      </w:tr>
+      <w:tr>
+        <w:tc>
+          <w:tcPr/>
+          <w:p>
+            <w:pPr>
+              <w:pStyle w:val="Compact"/>
+            </w:pPr>
+            <w:r>
+              <w:t xml:space="preserve">U</w:t>
+            </w:r>
+          </w:p>
+        </w:tc>
+        <w:tc>
+          <w:tcPr/>
+          <w:p>
+            <w:pPr>
+              <w:pStyle w:val="Compact"/>
+            </w:pPr>
+            <w:r>
+              <w:rPr>
+                <w:b/>
+                <w:bCs/>
+              </w:rPr>
+              <w:t xml:space="preserve">Finance</w:t>
+            </w:r>
+            <w:r>
+              <w:t xml:space="preserve"> </w:t>
+            </w:r>
+            <w:r>
+              <w:rPr>
+                <w:i/>
+                <w:iCs/>
+              </w:rPr>
+              <w:t xml:space="preserve">(added v1.0)</w:t>
+            </w:r>
+          </w:p>
+        </w:tc>
+        <w:tc>
+          <w:tcPr/>
+          <w:p>
+            <w:pPr>
+              <w:pStyle w:val="Compact"/>
+            </w:pPr>
+            <w:r>
+              <w:t xml:space="preserve">Monthly cash/burn/revenue snapshots, runway</w:t>
+            </w:r>
+          </w:p>
+        </w:tc>
+        <w:tc>
+          <w:tcPr/>
+          <w:p>
+            <w:pPr>
+              <w:pStyle w:val="Compact"/>
+            </w:pPr>
+            <w:r>
+              <w:t xml:space="preserve">Entity</w:t>
             </w:r>
           </w:p>
         </w:tc>
       </w:tr>
     </w:tbl>
+    <w:p>
+      <w:pPr>
+        <w:pStyle w:val="BodyText"/>
+      </w:pPr>
+      <w:r>
+        <w:rPr>
+          <w:b/>
+          <w:bCs/>
+        </w:rPr>
+        <w:t xml:space="preserve">[As built] additions within the contexts above:</w:t>
+      </w:r>
+      <w:r>
+        <w:t xml:space="preserve"> </w:t>
+      </w:r>
+      <w:r>
+        <w:t xml:space="preserve">CapTable also owns the</w:t>
+      </w:r>
+      <w:r>
+        <w:t xml:space="preserve"> </w:t>
+      </w:r>
+      <w:r>
+        <w:rPr>
+          <w:b/>
+          <w:bCs/>
+        </w:rPr>
+        <w:t xml:space="preserve">fully-diluted projection</w:t>
+      </w:r>
+      <w:r>
+        <w:t xml:space="preserve"> </w:t>
+      </w:r>
+      <w:r>
+        <w:t xml:space="preserve">and</w:t>
+      </w:r>
+      <w:r>
+        <w:t xml:space="preserve"> </w:t>
+      </w:r>
+      <w:r>
+        <w:rPr>
+          <w:b/>
+          <w:bCs/>
+        </w:rPr>
+        <w:t xml:space="preserve">anti-dilution</w:t>
+      </w:r>
+      <w:r>
+        <w:t xml:space="preserve"> </w:t>
+      </w:r>
+      <w:r>
+        <w:t xml:space="preserve">terms/calculator; Fundraising owns</w:t>
+      </w:r>
+      <w:r>
+        <w:t xml:space="preserve"> </w:t>
+      </w:r>
+      <w:r>
+        <w:rPr>
+          <w:b/>
+          <w:bCs/>
+        </w:rPr>
+        <w:t xml:space="preserve">SAFEs/notes with the Sec 42 offeree guardrail</w:t>
+      </w:r>
+      <w:r>
+        <w:t xml:space="preserve"> </w:t>
+      </w:r>
+      <w:r>
+        <w:t xml:space="preserve">and</w:t>
+      </w:r>
+      <w:r>
+        <w:t xml:space="preserve"> </w:t>
+      </w:r>
+      <w:r>
+        <w:rPr>
+          <w:b/>
+          <w:bCs/>
+        </w:rPr>
+        <w:t xml:space="preserve">investor kinds</w:t>
+      </w:r>
+      <w:r>
+        <w:t xml:space="preserve"> </w:t>
+      </w:r>
+      <w:r>
+        <w:t xml:space="preserve">(friends &amp; family / angel / institutional); FundAdmin owns</w:t>
+      </w:r>
+      <w:r>
+        <w:t xml:space="preserve"> </w:t>
+      </w:r>
+      <w:r>
+        <w:rPr>
+          <w:b/>
+          <w:bCs/>
+        </w:rPr>
+        <w:t xml:space="preserve">performance (DPI/RVPI/TVPI/XIRR), portfolio marks, unitised NAV, fee accrual+charging, the deal pipeline and Form 64C/64D</w:t>
+      </w:r>
+      <w:r>
+        <w:t xml:space="preserve">; Portal owns</w:t>
+      </w:r>
+      <w:r>
+        <w:t xml:space="preserve"> </w:t>
+      </w:r>
+      <w:r>
+        <w:rPr>
+          <w:b/>
+          <w:bCs/>
+        </w:rPr>
+        <w:t xml:space="preserve">investor consents</w:t>
+      </w:r>
+      <w:r>
+        <w:t xml:space="preserve"> </w:t>
+      </w:r>
+      <w:r>
+        <w:t xml:space="preserve">and</w:t>
+      </w:r>
+      <w:r>
+        <w:t xml:space="preserve"> </w:t>
+      </w:r>
+      <w:r>
+        <w:rPr>
+          <w:b/>
+          <w:bCs/>
+        </w:rPr>
+        <w:t xml:space="preserve">secondary-sale (ROFR) requests</w:t>
+      </w:r>
+      <w:r>
+        <w:t xml:space="preserve">; Workspace owns the</w:t>
+      </w:r>
+      <w:r>
+        <w:t xml:space="preserve"> </w:t>
+      </w:r>
+      <w:r>
+        <w:rPr>
+          <w:b/>
+          <w:bCs/>
+        </w:rPr>
+        <w:t xml:space="preserve">stage registry</w:t>
+      </w:r>
+      <w:r>
+        <w:t xml:space="preserve"> </w:t>
+      </w:r>
+      <w:r>
+        <w:t xml:space="preserve">(</w:t>
+      </w:r>
+      <w:r>
+        <w:rPr>
+          <w:rStyle w:val="VerbatimChar"/>
+        </w:rPr>
+        <w:t xml:space="preserve">app/stages.py</w:t>
+      </w:r>
+      <w:r>
+        <w:t xml:space="preserve">) that drives progressive disclosure.</w:t>
+      </w:r>
+    </w:p>
     <w:p>
       <w:r>
         <w:pict>
@@ -2422,6 +2924,55 @@
       </w:pPr>
       <w:r>
         <w:t xml:space="preserve">5. Technology Stack</w:t>
+      </w:r>
+    </w:p>
+    <w:p>
+      <w:pPr>
+        <w:pStyle w:val="FirstParagraph"/>
+      </w:pPr>
+      <w:r>
+        <w:rPr>
+          <w:b/>
+          <w:bCs/>
+        </w:rPr>
+        <w:t xml:space="preserve">[As built]</w:t>
+      </w:r>
+      <w:r>
+        <w:t xml:space="preserve"> </w:t>
+      </w:r>
+      <w:r>
+        <w:t xml:space="preserve">FastAPI + SQLAlchemy 2.0 + Pydantic v2; React 18 + Vite + TypeScript with a plain typed</w:t>
+      </w:r>
+      <w:r>
+        <w:t xml:space="preserve"> </w:t>
+      </w:r>
+      <w:r>
+        <w:rPr>
+          <w:rStyle w:val="VerbatimChar"/>
+        </w:rPr>
+        <w:t xml:space="preserve">fetch</w:t>
+      </w:r>
+      <w:r>
+        <w:t xml:space="preserve"> </w:t>
+      </w:r>
+      <w:r>
+        <w:t xml:space="preserve">client (no component library or TanStack Query yet — deliberate minimalism); vitest + Testing Library on the frontend, pytest (174 tests) on the backend; Alembic for schema evolution; SQLite in dev, Postgres-ready. Rows marked</w:t>
+      </w:r>
+      <w:r>
+        <w:t xml:space="preserve"> </w:t>
+      </w:r>
+      <w:r>
+        <w:rPr>
+          <w:i/>
+          <w:iCs/>
+        </w:rPr>
+        <w:t xml:space="preserve">(target)</w:t>
+      </w:r>
+      <w:r>
+        <w:t xml:space="preserve"> </w:t>
+      </w:r>
+      <w:r>
+        <w:t xml:space="preserve">below await deployment.</w:t>
       </w:r>
     </w:p>
     <w:tbl>
@@ -2611,6 +3162,16 @@
             <w:r>
               <w:t xml:space="preserve">PostgreSQL 16 (Cloud SQL HA) + read replica</w:t>
             </w:r>
+            <w:r>
+              <w:t xml:space="preserve"> </w:t>
+            </w:r>
+            <w:r>
+              <w:rPr>
+                <w:i/>
+                <w:iCs/>
+              </w:rPr>
+              <w:t xml:space="preserve">(target; SQLite in dev)</w:t>
+            </w:r>
           </w:p>
         </w:tc>
         <w:tc>
@@ -2646,6 +3207,16 @@
             <w:r>
               <w:t xml:space="preserve">GCS buckets (India region), per-tenant prefixes, CMEK</w:t>
             </w:r>
+            <w:r>
+              <w:t xml:space="preserve"> </w:t>
+            </w:r>
+            <w:r>
+              <w:rPr>
+                <w:i/>
+                <w:iCs/>
+              </w:rPr>
+              <w:t xml:space="preserve">(target; documents render as text in-DB today)</w:t>
+            </w:r>
           </w:p>
         </w:tc>
         <w:tc>
@@ -2681,6 +3252,16 @@
             <w:r>
               <w:t xml:space="preserve">Redis (Memorystore)</w:t>
             </w:r>
+            <w:r>
+              <w:t xml:space="preserve"> </w:t>
+            </w:r>
+            <w:r>
+              <w:rPr>
+                <w:i/>
+                <w:iCs/>
+              </w:rPr>
+              <w:t xml:space="preserve">(target; login rate-limiter is in-memory today)</w:t>
+            </w:r>
           </w:p>
         </w:tc>
         <w:tc>
@@ -2715,6 +3296,16 @@
             </w:pPr>
             <w:r>
               <w:t xml:space="preserve">Cloud Tasks + worker Cloud Run service</w:t>
+            </w:r>
+            <w:r>
+              <w:t xml:space="preserve"> </w:t>
+            </w:r>
+            <w:r>
+              <w:rPr>
+                <w:i/>
+                <w:iCs/>
+              </w:rPr>
+              <w:t xml:space="preserve">(target; alert sweep is an endpoint today)</w:t>
             </w:r>
           </w:p>
         </w:tc>
@@ -3019,7 +3610,7 @@
       </w:r>
     </w:p>
     <w:bookmarkEnd w:id="24"/>
-    <w:bookmarkStart w:id="30" w:name="X9e55b3d3cefb61f21823ded8c92669578c6fb2b"/>
+    <w:bookmarkStart w:id="31" w:name="X9e55b3d3cefb61f21823ded8c92669578c6fb2b"/>
     <w:p>
       <w:pPr>
         <w:pStyle w:val="Heading2"/>
@@ -3335,21 +3926,6 @@
         <w:t xml:space="preserve"> </w:t>
       </w:r>
       <w:r>
-        <w:t xml:space="preserve">(CapTable) and</w:t>
-      </w:r>
-      <w:r>
-        <w:t xml:space="preserve"> </w:t>
-      </w:r>
-      <w:r>
-        <w:rPr>
-          <w:rStyle w:val="VerbatimChar"/>
-        </w:rPr>
-        <w:t xml:space="preserve">CapitalCall</w:t>
-      </w:r>
-      <w:r>
-        <w:t xml:space="preserve"> </w:t>
-      </w:r>
-      <w:r>
         <w:t xml:space="preserve">/</w:t>
       </w:r>
       <w:r>
@@ -3359,13 +3935,73 @@
         <w:rPr>
           <w:rStyle w:val="VerbatimChar"/>
         </w:rPr>
+        <w:t xml:space="preserve">Buyback</w:t>
+      </w:r>
+      <w:r>
+        <w:t xml:space="preserve"> </w:t>
+      </w:r>
+      <w:r>
+        <w:t xml:space="preserve">/</w:t>
+      </w:r>
+      <w:r>
+        <w:t xml:space="preserve"> </w:t>
+      </w:r>
+      <w:r>
+        <w:rPr>
+          <w:rStyle w:val="VerbatimChar"/>
+        </w:rPr>
+        <w:t xml:space="preserve">CorporateAction</w:t>
+      </w:r>
+      <w:r>
+        <w:t xml:space="preserve"> </w:t>
+      </w:r>
+      <w:r>
+        <w:t xml:space="preserve">/ rights events (CapTable) and</w:t>
+      </w:r>
+      <w:r>
+        <w:t xml:space="preserve"> </w:t>
+      </w:r>
+      <w:r>
+        <w:rPr>
+          <w:rStyle w:val="VerbatimChar"/>
+        </w:rPr>
+        <w:t xml:space="preserve">DrawdownNotice</w:t>
+      </w:r>
+      <w:r>
+        <w:t xml:space="preserve"> </w:t>
+      </w:r>
+      <w:r>
+        <w:t xml:space="preserve">/</w:t>
+      </w:r>
+      <w:r>
+        <w:t xml:space="preserve"> </w:t>
+      </w:r>
+      <w:r>
+        <w:rPr>
+          <w:rStyle w:val="VerbatimChar"/>
+        </w:rPr>
         <w:t xml:space="preserve">Distribution</w:t>
       </w:r>
       <w:r>
         <w:t xml:space="preserve"> </w:t>
       </w:r>
       <w:r>
-        <w:t xml:space="preserve">(FundAdmin) events.</w:t>
+        <w:t xml:space="preserve">/</w:t>
+      </w:r>
+      <w:r>
+        <w:t xml:space="preserve"> </w:t>
+      </w:r>
+      <w:r>
+        <w:rPr>
+          <w:rStyle w:val="VerbatimChar"/>
+        </w:rPr>
+        <w:t xml:space="preserve">FeeCharge</w:t>
+      </w:r>
+      <w:r>
+        <w:t xml:space="preserve"> </w:t>
+      </w:r>
+      <w:r>
+        <w:t xml:space="preserve">events (FundAdmin).</w:t>
       </w:r>
     </w:p>
     <w:p>
@@ -3378,30 +4014,38 @@
       </w:pPr>
       <w:r>
         <w:rPr>
-          <w:rStyle w:val="VerbatimChar"/>
-        </w:rPr>
-        <w:t xml:space="preserve">CapTableSnapshot</w:t>
-      </w:r>
-      <w:r>
-        <w:t xml:space="preserve"> </w:t>
-      </w:r>
-      <w:r>
-        <w:t xml:space="preserve">/</w:t>
-      </w:r>
-      <w:r>
-        <w:t xml:space="preserve"> </w:t>
-      </w:r>
-      <w:r>
-        <w:rPr>
-          <w:rStyle w:val="VerbatimChar"/>
-        </w:rPr>
-        <w:t xml:space="preserve">CapitalAccount</w:t>
-      </w:r>
-      <w:r>
-        <w:t xml:space="preserve"> </w:t>
-      </w:r>
-      <w:r>
-        <w:t xml:space="preserve">are materialised projections, recomputable from the ledger, stamped with effective date and source document.</w:t>
+          <w:b/>
+          <w:bCs/>
+        </w:rPr>
+        <w:t xml:space="preserve">[As built]</w:t>
+      </w:r>
+      <w:r>
+        <w:t xml:space="preserve"> </w:t>
+      </w:r>
+      <w:r>
+        <w:t xml:space="preserve">Projections are computed on read rather than materialised: the cap table (and its fully-diluted variant), capital accounts, fund performance and the liquidation waterfall all replay the ledger chronologically with</w:t>
+      </w:r>
+      <w:r>
+        <w:t xml:space="preserve"> </w:t>
+      </w:r>
+      <w:r>
+        <w:rPr>
+          <w:b/>
+          <w:bCs/>
+        </w:rPr>
+        <w:t xml:space="preserve">cost basis following the shares</w:t>
+      </w:r>
+      <w:r>
+        <w:t xml:space="preserve">; nothing is stored as a balance. Deterministic ordering is guaranteed by microsecond Python-side timestamps (</w:t>
+      </w:r>
+      <w:r>
+        <w:rPr>
+          <w:rStyle w:val="VerbatimChar"/>
+        </w:rPr>
+        <w:t xml:space="preserve">app/clock.py</w:t>
+      </w:r>
+      <w:r>
+        <w:t xml:space="preserve">, IST).</w:t>
       </w:r>
     </w:p>
     <w:p>
@@ -3490,15 +4134,140 @@
       </w:r>
     </w:p>
     <w:p>
+      <w:pPr>
+        <w:pStyle w:val="BodyText"/>
+      </w:pPr>
+      <w:r>
+        <w:rPr>
+          <w:b/>
+          <w:bCs/>
+        </w:rPr>
+        <w:t xml:space="preserve">[As built]</w:t>
+      </w:r>
+      <w:r>
+        <w:t xml:space="preserve"> </w:t>
+      </w:r>
+      <w:r>
+        <w:t xml:space="preserve">Rules live as Python data registries (a pragmatic first step toward reference tables): compliance rules (</w:t>
+      </w:r>
+      <w:r>
+        <w:rPr>
+          <w:rStyle w:val="VerbatimChar"/>
+        </w:rPr>
+        <w:t xml:space="preserve">app/compliance/rules.py</w:t>
+      </w:r>
+      <w:r>
+        <w:t xml:space="preserve"> </w:t>
+      </w:r>
+      <w:r>
+        <w:t xml:space="preserve">— annual ROC, monthly GST/quarterly TDS, SEBI AIF calendar), document templates (</w:t>
+      </w:r>
+      <w:r>
+        <w:rPr>
+          <w:rStyle w:val="VerbatimChar"/>
+        </w:rPr>
+        <w:t xml:space="preserve">app/documents/templates.py</w:t>
+      </w:r>
+      <w:r>
+        <w:t xml:space="preserve">, ~20 India-specific), workflow definitions (</w:t>
+      </w:r>
+      <w:r>
+        <w:rPr>
+          <w:rStyle w:val="VerbatimChar"/>
+        </w:rPr>
+        <w:t xml:space="preserve">app/workflows/registry.py</w:t>
+      </w:r>
+      <w:r>
+        <w:t xml:space="preserve">), and the</w:t>
+      </w:r>
+      <w:r>
+        <w:t xml:space="preserve"> </w:t>
+      </w:r>
+      <w:r>
+        <w:rPr>
+          <w:b/>
+          <w:bCs/>
+        </w:rPr>
+        <w:t xml:space="preserve">stage registry</w:t>
+      </w:r>
+      <w:r>
+        <w:t xml:space="preserve"> </w:t>
+      </w:r>
+      <w:r>
+        <w:t xml:space="preserve">(</w:t>
+      </w:r>
+      <w:r>
+        <w:rPr>
+          <w:rStyle w:val="VerbatimChar"/>
+        </w:rPr>
+        <w:t xml:space="preserve">app/stages.py</w:t>
+      </w:r>
+      <w:r>
+        <w:t xml:space="preserve"> </w:t>
+      </w:r>
+      <w:r>
+        <w:t xml:space="preserve">— lifecycle stages, tab/feature gating, guided checklists). Event-based filings (PAS-3, MGT-14, DIR-12, FC-GPR) are injected idempotently by domain services.</w:t>
+      </w:r>
+    </w:p>
+    <w:bookmarkEnd w:id="29"/>
+    <w:bookmarkStart w:id="30" w:name="X09c106ab22f43c2570912c8714b0c458661a14f"/>
+    <w:p>
+      <w:pPr>
+        <w:pStyle w:val="Heading3"/>
+      </w:pPr>
+      <w:r>
+        <w:t xml:space="preserve">6.6 Schema evolution</w:t>
+      </w:r>
+    </w:p>
+    <w:p>
+      <w:pPr>
+        <w:pStyle w:val="FirstParagraph"/>
+      </w:pPr>
+      <w:r>
+        <w:rPr>
+          <w:b/>
+          <w:bCs/>
+        </w:rPr>
+        <w:t xml:space="preserve">[As built]</w:t>
+      </w:r>
+      <w:r>
+        <w:t xml:space="preserve"> </w:t>
+      </w:r>
+      <w:r>
+        <w:t xml:space="preserve">Alembic owns the schema: a verified 67-table baseline plus incremental revisions (anti-dilution/waterfall, stage, investor kind, portfolio marks, fees, deals, consents/secondary — 71 tables at v1.3), each checked for column-level parity against the models. Dev may auto-create tables (</w:t>
+      </w:r>
+      <w:r>
+        <w:rPr>
+          <w:rStyle w:val="VerbatimChar"/>
+        </w:rPr>
+        <w:t xml:space="preserve">PAPER_AUTO_CREATE_TABLES</w:t>
+      </w:r>
+      <w:r>
+        <w:t xml:space="preserve">); production runs</w:t>
+      </w:r>
+      <w:r>
+        <w:t xml:space="preserve"> </w:t>
+      </w:r>
+      <w:r>
+        <w:rPr>
+          <w:rStyle w:val="VerbatimChar"/>
+        </w:rPr>
+        <w:t xml:space="preserve">alembic upgrade head</w:t>
+      </w:r>
+      <w:r>
+        <w:t xml:space="preserve">.</w:t>
+      </w:r>
+    </w:p>
+    <w:p>
       <w:r>
         <w:pict>
           <v:rect style="width:0;height:1.5pt" o:hralign="center" o:hrstd="t" o:hr="t"/>
         </w:pict>
       </w:r>
     </w:p>
-    <w:bookmarkEnd w:id="29"/>
     <w:bookmarkEnd w:id="30"/>
-    <w:bookmarkStart w:id="31" w:name="X3b93240a9b4cf8514cff21e05d2e4747805f3be"/>
+    <w:bookmarkEnd w:id="31"/>
+    <w:bookmarkStart w:id="32" w:name="X3b93240a9b4cf8514cff21e05d2e4747805f3be"/>
     <w:p>
       <w:pPr>
         <w:pStyle w:val="Heading2"/>
@@ -3770,14 +4539,62 @@
       </w:r>
     </w:p>
     <w:p>
+      <w:pPr>
+        <w:pStyle w:val="BodyText"/>
+      </w:pPr>
+      <w:r>
+        <w:rPr>
+          <w:b/>
+          <w:bCs/>
+        </w:rPr>
+        <w:t xml:space="preserve">[As built]</w:t>
+      </w:r>
+      <w:r>
+        <w:t xml:space="preserve"> </w:t>
+      </w:r>
+      <w:r>
+        <w:t xml:space="preserve">The engine exists as designed (definitions-as-data, persisted runs/steps, suspend/resume, conditional branching — e.g. foreign investor → FC-GPR step;</w:t>
+      </w:r>
+      <w:r>
+        <w:t xml:space="preserve"> </w:t>
+      </w:r>
+      <w:r>
+        <w:rPr>
+          <w:rStyle w:val="VerbatimChar"/>
+        </w:rPr>
+        <w:t xml:space="preserve">generate-document</w:t>
+      </w:r>
+      <w:r>
+        <w:t xml:space="preserve"> </w:t>
+      </w:r>
+      <w:r>
+        <w:t xml:space="preserve">and</w:t>
+      </w:r>
+      <w:r>
+        <w:t xml:space="preserve"> </w:t>
+      </w:r>
+      <w:r>
+        <w:rPr>
+          <w:rStyle w:val="VerbatimChar"/>
+        </w:rPr>
+        <w:t xml:space="preserve">request-signature</w:t>
+      </w:r>
+      <w:r>
+        <w:t xml:space="preserve"> </w:t>
+      </w:r>
+      <w:r>
+        <w:t xml:space="preserve">steps call the real Document module). In practice most v1 mutations happen through module routes directly rather than inside workflow runs; the audit middleware (every mutating request logged with actor) provides the audit trail the workflow layer was designed to guarantee. Routing more mutations through workflows remains the target as processes formalise.</w:t>
+      </w:r>
+    </w:p>
+    <w:p>
       <w:r>
         <w:pict>
           <v:rect style="width:0;height:1.5pt" o:hralign="center" o:hrstd="t" o:hr="t"/>
         </w:pict>
       </w:r>
     </w:p>
-    <w:bookmarkEnd w:id="31"/>
-    <w:bookmarkStart w:id="32" w:name="X64b15e8e443f0bf9347b90ecea236887dcc9dfd"/>
+    <w:bookmarkEnd w:id="32"/>
+    <w:bookmarkStart w:id="33" w:name="X64b15e8e443f0bf9347b90ecea236887dcc9dfd"/>
     <w:p>
       <w:pPr>
         <w:pStyle w:val="Heading2"/>
@@ -4194,14 +5011,61 @@
       </w:r>
     </w:p>
     <w:p>
+      <w:pPr>
+        <w:pStyle w:val="BodyText"/>
+      </w:pPr>
+      <w:r>
+        <w:rPr>
+          <w:b/>
+          <w:bCs/>
+        </w:rPr>
+        <w:t xml:space="preserve">[As built]</w:t>
+      </w:r>
+      <w:r>
+        <w:t xml:space="preserve"> </w:t>
+      </w:r>
+      <w:r>
+        <w:t xml:space="preserve">All providers in the table are</w:t>
+      </w:r>
+      <w:r>
+        <w:t xml:space="preserve"> </w:t>
+      </w:r>
+      <w:r>
+        <w:rPr>
+          <w:b/>
+          <w:bCs/>
+        </w:rPr>
+        <w:t xml:space="preserve">credential-blocked</w:t>
+      </w:r>
+      <w:r>
+        <w:t xml:space="preserve">; none are wired yet. The e-sign flow is implemented end-to-end against a</w:t>
+      </w:r>
+      <w:r>
+        <w:t xml:space="preserve"> </w:t>
+      </w:r>
+      <w:r>
+        <w:rPr>
+          <w:b/>
+          <w:bCs/>
+        </w:rPr>
+        <w:t xml:space="preserve">simulated provider</w:t>
+      </w:r>
+      <w:r>
+        <w:t xml:space="preserve"> </w:t>
+      </w:r>
+      <w:r>
+        <w:t xml:space="preserve">(request → callback → signed) so the adapter seam is proven; MCA21/FIRMS follow the prepare-and-assist model (obligations, SRN capture) without portal calls.</w:t>
+      </w:r>
+    </w:p>
+    <w:p>
       <w:r>
         <w:pict>
           <v:rect style="width:0;height:1.5pt" o:hralign="center" o:hrstd="t" o:hr="t"/>
         </w:pict>
       </w:r>
     </w:p>
-    <w:bookmarkEnd w:id="32"/>
-    <w:bookmarkStart w:id="37" w:name="X897718c2873dd2f41612e074b34b68accd1a6de"/>
+    <w:bookmarkEnd w:id="33"/>
+    <w:bookmarkStart w:id="38" w:name="X897718c2873dd2f41612e074b34b68accd1a6de"/>
     <w:p>
       <w:pPr>
         <w:pStyle w:val="Heading2"/>
@@ -4210,7 +5074,7 @@
         <w:t xml:space="preserve">9. Key Runtime Flows</w:t>
       </w:r>
     </w:p>
-    <w:bookmarkStart w:id="33" w:name="Xcc00c0b45289a1c270c34fad43f5745d2b2e96f"/>
+    <w:bookmarkStart w:id="34" w:name="Xcc00c0b45289a1c270c34fad43f5745d2b2e96f"/>
     <w:p>
       <w:pPr>
         <w:pStyle w:val="Heading3"/>
@@ -4293,8 +5157,8 @@
         <w:t xml:space="preserve">  → generate compliance calendar (Compliance) from incorp date/FY</w:t>
       </w:r>
     </w:p>
-    <w:bookmarkEnd w:id="33"/>
-    <w:bookmarkStart w:id="34" w:name="X09321a5efb4e2816ed1530b1ea6af58b2341185"/>
+    <w:bookmarkEnd w:id="34"/>
+    <w:bookmarkStart w:id="35" w:name="X09321a5efb4e2816ed1530b1ea6af58b2341185"/>
     <w:p>
       <w:pPr>
         <w:pStyle w:val="Heading3"/>
@@ -4404,8 +5268,8 @@
         <w:t xml:space="preserve">  → publish investor portal holdings</w:t>
       </w:r>
     </w:p>
-    <w:bookmarkEnd w:id="34"/>
-    <w:bookmarkStart w:id="35" w:name="X5c2a246798ee996e19e4e014c2cb754d81289b0"/>
+    <w:bookmarkEnd w:id="35"/>
+    <w:bookmarkStart w:id="36" w:name="X5c2a246798ee996e19e4e014c2cb754d81289b0"/>
     <w:p>
       <w:pPr>
         <w:pStyle w:val="Heading3"/>
@@ -4470,8 +5334,8 @@
         <w:t xml:space="preserve">  → LP portal reflects drawn/remaining</w:t>
       </w:r>
     </w:p>
-    <w:bookmarkEnd w:id="35"/>
-    <w:bookmarkStart w:id="36" w:name="X295b045b1e18da4f70f147405af4c240cadc086"/>
+    <w:bookmarkEnd w:id="36"/>
+    <w:bookmarkStart w:id="37" w:name="X295b045b1e18da4f70f147405af4c240cadc086"/>
     <w:p>
       <w:pPr>
         <w:pStyle w:val="Heading3"/>
@@ -4525,9 +5389,9 @@
         </w:pict>
       </w:r>
     </w:p>
-    <w:bookmarkEnd w:id="36"/>
     <w:bookmarkEnd w:id="37"/>
-    <w:bookmarkStart w:id="38" w:name="X0f5a79196ab9697f8401b7890b485cc83b629d4"/>
+    <w:bookmarkEnd w:id="38"/>
+    <w:bookmarkStart w:id="39" w:name="X0f5a79196ab9697f8401b7890b485cc83b629d4"/>
     <w:p>
       <w:pPr>
         <w:pStyle w:val="Heading2"/>
@@ -4781,14 +5645,98 @@
       </w:r>
     </w:p>
     <w:p>
+      <w:pPr>
+        <w:pStyle w:val="FirstParagraph"/>
+      </w:pPr>
+      <w:r>
+        <w:rPr>
+          <w:b/>
+          <w:bCs/>
+        </w:rPr>
+        <w:t xml:space="preserve">[As built]</w:t>
+      </w:r>
+      <w:r>
+        <w:t xml:space="preserve"> </w:t>
+      </w:r>
+      <w:r>
+        <w:t xml:space="preserve">AuthN is email+password (scrypt) issuing short-lived JWTs with refresh; login failures are rate-limited (5/5min per email, in-memory — Redis-backed when multi-instance); the app</w:t>
+      </w:r>
+      <w:r>
+        <w:t xml:space="preserve"> </w:t>
+      </w:r>
+      <w:r>
+        <w:rPr>
+          <w:b/>
+          <w:bCs/>
+        </w:rPr>
+        <w:t xml:space="preserve">refuses to boot with the default JWT secret outside dev/test</w:t>
+      </w:r>
+      <w:r>
+        <w:t xml:space="preserve">. AuthZ is app-layer RBAC via a generated dependency-per-resource pattern (</w:t>
+      </w:r>
+      <w:r>
+        <w:rPr>
+          <w:rStyle w:val="VerbatimChar"/>
+        </w:rPr>
+        <w:t xml:space="preserve">app/deps.py</w:t>
+      </w:r>
+      <w:r>
+        <w:t xml:space="preserve"> </w:t>
+      </w:r>
+      <w:r>
+        <w:t xml:space="preserve">— every entity-owned resource resolves ownership and the caller's tenant role; body-referenced ids are guarded by</w:t>
+      </w:r>
+      <w:r>
+        <w:t xml:space="preserve"> </w:t>
+      </w:r>
+      <w:r>
+        <w:rPr>
+          <w:rStyle w:val="VerbatimChar"/>
+        </w:rPr>
+        <w:t xml:space="preserve">get_owned</w:t>
+      </w:r>
+      <w:r>
+        <w:t xml:space="preserve"> </w:t>
+      </w:r>
+      <w:r>
+        <w:t xml:space="preserve">against cross-entity injection). Postgres RLS (ADR-5) is designed but</w:t>
+      </w:r>
+      <w:r>
+        <w:t xml:space="preserve"> </w:t>
+      </w:r>
+      <w:r>
+        <w:rPr>
+          <w:b/>
+          <w:bCs/>
+        </w:rPr>
+        <w:t xml:space="preserve">pends the Postgres deployment</w:t>
+      </w:r>
+      <w:r>
+        <w:t xml:space="preserve">; on SQLite only the app-layer checks apply. The portal is a second trust boundary: investors/LPs/employees are matched</w:t>
+      </w:r>
+      <w:r>
+        <w:t xml:space="preserve"> </w:t>
+      </w:r>
+      <w:r>
+        <w:rPr>
+          <w:b/>
+          <w:bCs/>
+        </w:rPr>
+        <w:t xml:space="preserve">by email</w:t>
+      </w:r>
+      <w:r>
+        <w:t xml:space="preserve">, receive read-only scoped views, and their two write actions (consent decisions, secondary-sale requests) are authorised against that email match, never tenant membership. OIDC/OTP/MFA and DSC registration remain target.</w:t>
+      </w:r>
+    </w:p>
+    <w:p>
       <w:r>
         <w:pict>
           <v:rect style="width:0;height:1.5pt" o:hralign="center" o:hrstd="t" o:hr="t"/>
         </w:pict>
       </w:r>
     </w:p>
-    <w:bookmarkEnd w:id="38"/>
-    <w:bookmarkStart w:id="39" w:name="X5e01f2d96969b720b352d47cab1e2727d37fe38"/>
+    <w:bookmarkEnd w:id="39"/>
+    <w:bookmarkStart w:id="40" w:name="X5e01f2d96969b720b352d47cab1e2727d37fe38"/>
     <w:p>
       <w:pPr>
         <w:pStyle w:val="Heading2"/>
@@ -5063,14 +6011,104 @@
       </w:r>
     </w:p>
     <w:p>
+      <w:pPr>
+        <w:pStyle w:val="FirstParagraph"/>
+      </w:pPr>
+      <w:r>
+        <w:rPr>
+          <w:b/>
+          <w:bCs/>
+        </w:rPr>
+        <w:t xml:space="preserve">[As built]</w:t>
+      </w:r>
+      <w:r>
+        <w:t xml:space="preserve"> </w:t>
+      </w:r>
+      <w:r>
+        <w:t xml:space="preserve">Not yet deployed — deferred by decision until Cloud SQL exists (plan and sequencing in</w:t>
+      </w:r>
+      <w:r>
+        <w:t xml:space="preserve"> </w:t>
+      </w:r>
+      <w:r>
+        <w:rPr>
+          <w:rStyle w:val="VerbatimChar"/>
+        </w:rPr>
+        <w:t xml:space="preserve">DEPLOYMENT.md</w:t>
+      </w:r>
+      <w:r>
+        <w:t xml:space="preserve">). In place today: the GitHub Actions CI workflow (pytest +</w:t>
+      </w:r>
+      <w:r>
+        <w:t xml:space="preserve"> </w:t>
+      </w:r>
+      <w:r>
+        <w:rPr>
+          <w:rStyle w:val="VerbatimChar"/>
+        </w:rPr>
+        <w:t xml:space="preserve">alembic upgrade head</w:t>
+      </w:r>
+      <w:r>
+        <w:t xml:space="preserve"> </w:t>
+      </w:r>
+      <w:r>
+        <w:t xml:space="preserve">verification + frontend build), Alembic migrations, environment-driven config (</w:t>
+      </w:r>
+      <w:r>
+        <w:rPr>
+          <w:rStyle w:val="VerbatimChar"/>
+        </w:rPr>
+        <w:t xml:space="preserve">PAPER_DATABASE_URL</w:t>
+      </w:r>
+      <w:r>
+        <w:t xml:space="preserve">,</w:t>
+      </w:r>
+      <w:r>
+        <w:t xml:space="preserve"> </w:t>
+      </w:r>
+      <w:r>
+        <w:rPr>
+          <w:rStyle w:val="VerbatimChar"/>
+        </w:rPr>
+        <w:t xml:space="preserve">PAPER_ENVIRONMENT</w:t>
+      </w:r>
+      <w:r>
+        <w:t xml:space="preserve">,</w:t>
+      </w:r>
+      <w:r>
+        <w:t xml:space="preserve"> </w:t>
+      </w:r>
+      <w:r>
+        <w:rPr>
+          <w:rStyle w:val="VerbatimChar"/>
+        </w:rPr>
+        <w:t xml:space="preserve">PAPER_JWT_SECRET</w:t>
+      </w:r>
+      <w:r>
+        <w:t xml:space="preserve">,</w:t>
+      </w:r>
+      <w:r>
+        <w:t xml:space="preserve"> </w:t>
+      </w:r>
+      <w:r>
+        <w:rPr>
+          <w:rStyle w:val="VerbatimChar"/>
+        </w:rPr>
+        <w:t xml:space="preserve">PAPER_CORS_ORIGINS</w:t>
+      </w:r>
+      <w:r>
+        <w:t xml:space="preserve">), and local dev via uvicorn + Vite.</w:t>
+      </w:r>
+    </w:p>
+    <w:p>
       <w:r>
         <w:pict>
           <v:rect style="width:0;height:1.5pt" o:hralign="center" o:hrstd="t" o:hr="t"/>
         </w:pict>
       </w:r>
     </w:p>
-    <w:bookmarkEnd w:id="39"/>
-    <w:bookmarkStart w:id="40" w:name="X7b53c4517e26039fdd447c09a49465dfcb19fc1"/>
+    <w:bookmarkEnd w:id="40"/>
+    <w:bookmarkStart w:id="41" w:name="X7b53c4517e26039fdd447c09a49465dfcb19fc1"/>
     <w:p>
       <w:pPr>
         <w:pStyle w:val="Heading2"/>
@@ -5316,8 +6354,8 @@
         </w:pict>
       </w:r>
     </w:p>
-    <w:bookmarkEnd w:id="40"/>
-    <w:bookmarkStart w:id="41" w:name="Xfdb41bd0dad8814b5a2ea76d4262d9e11f61d75"/>
+    <w:bookmarkEnd w:id="41"/>
+    <w:bookmarkStart w:id="42" w:name="Xfdb41bd0dad8814b5a2ea76d4262d9e11f61d75"/>
     <w:p>
       <w:pPr>
         <w:pStyle w:val="Heading2"/>
@@ -5709,6 +6747,192 @@
           </w:p>
         </w:tc>
       </w:tr>
+      <w:tr>
+        <w:tc>
+          <w:tcPr/>
+          <w:p>
+            <w:pPr>
+              <w:pStyle w:val="Compact"/>
+            </w:pPr>
+            <w:r>
+              <w:t xml:space="preserve">ADR-8</w:t>
+            </w:r>
+            <w:r>
+              <w:t xml:space="preserve"> </w:t>
+            </w:r>
+            <w:r>
+              <w:rPr>
+                <w:i/>
+                <w:iCs/>
+              </w:rPr>
+              <w:t xml:space="preserve">(added v1.0)</w:t>
+            </w:r>
+          </w:p>
+        </w:tc>
+        <w:tc>
+          <w:tcPr/>
+          <w:p>
+            <w:pPr>
+              <w:pStyle w:val="Compact"/>
+            </w:pPr>
+            <w:r>
+              <w:t xml:space="preserve">Uniform IST platform clock (</w:t>
+            </w:r>
+            <w:r>
+              <w:rPr>
+                <w:rStyle w:val="VerbatimChar"/>
+              </w:rPr>
+              <w:t xml:space="preserve">app/clock.py</w:t>
+            </w:r>
+            <w:r>
+              <w:t xml:space="preserve">) for all recorded times; JWT exp/iat stay UTC</w:t>
+            </w:r>
+          </w:p>
+        </w:tc>
+        <w:tc>
+          <w:tcPr/>
+          <w:p>
+            <w:pPr>
+              <w:pStyle w:val="Compact"/>
+            </w:pPr>
+            <w:r>
+              <w:t xml:space="preserve">Host timezones vary (dev boxes, Cloud Run is UTC); due-date and accrual math must not shift on deployment</w:t>
+            </w:r>
+          </w:p>
+        </w:tc>
+        <w:tc>
+          <w:tcPr/>
+          <w:p>
+            <w:pPr>
+              <w:pStyle w:val="Compact"/>
+            </w:pPr>
+            <w:r>
+              <w:t xml:space="preserve">Naive-IST columns; conversions needed if multi-timezone display ever matters.</w:t>
+            </w:r>
+          </w:p>
+        </w:tc>
+      </w:tr>
+      <w:tr>
+        <w:tc>
+          <w:tcPr/>
+          <w:p>
+            <w:pPr>
+              <w:pStyle w:val="Compact"/>
+            </w:pPr>
+            <w:r>
+              <w:t xml:space="preserve">ADR-9</w:t>
+            </w:r>
+            <w:r>
+              <w:t xml:space="preserve"> </w:t>
+            </w:r>
+            <w:r>
+              <w:rPr>
+                <w:i/>
+                <w:iCs/>
+              </w:rPr>
+              <w:t xml:space="preserve">(added v1.0)</w:t>
+            </w:r>
+          </w:p>
+        </w:tc>
+        <w:tc>
+          <w:tcPr/>
+          <w:p>
+            <w:pPr>
+              <w:pStyle w:val="Compact"/>
+            </w:pPr>
+            <w:r>
+              <w:t xml:space="preserve">Stage-based progressive disclosure as data (</w:t>
+            </w:r>
+            <w:r>
+              <w:rPr>
+                <w:rStyle w:val="VerbatimChar"/>
+              </w:rPr>
+              <w:t xml:space="preserve">app/stages.py</w:t>
+            </w:r>
+            <w:r>
+              <w:t xml:space="preserve">)</w:t>
+            </w:r>
+          </w:p>
+        </w:tc>
+        <w:tc>
+          <w:tcPr/>
+          <w:p>
+            <w:pPr>
+              <w:pStyle w:val="Compact"/>
+            </w:pPr>
+            <w:r>
+              <w:t xml:space="preserve">21 modules overwhelm a first-time founder; stages surface what matters now with auto-checked guidance</w:t>
+            </w:r>
+          </w:p>
+        </w:tc>
+        <w:tc>
+          <w:tcPr/>
+          <w:p>
+            <w:pPr>
+              <w:pStyle w:val="Compact"/>
+            </w:pPr>
+            <w:r>
+              <w:t xml:space="preserve">Stage/tab/feature mappings must be maintained as modules evolve; "show all" escape hatch prevents lock-out.</w:t>
+            </w:r>
+          </w:p>
+        </w:tc>
+      </w:tr>
+      <w:tr>
+        <w:tc>
+          <w:tcPr/>
+          <w:p>
+            <w:pPr>
+              <w:pStyle w:val="Compact"/>
+            </w:pPr>
+            <w:r>
+              <w:t xml:space="preserve">ADR-10</w:t>
+            </w:r>
+            <w:r>
+              <w:t xml:space="preserve"> </w:t>
+            </w:r>
+            <w:r>
+              <w:rPr>
+                <w:i/>
+                <w:iCs/>
+              </w:rPr>
+              <w:t xml:space="preserve">(added v1.0)</w:t>
+            </w:r>
+          </w:p>
+        </w:tc>
+        <w:tc>
+          <w:tcPr/>
+          <w:p>
+            <w:pPr>
+              <w:pStyle w:val="Compact"/>
+            </w:pPr>
+            <w:r>
+              <w:t xml:space="preserve">Projections computed on read (no materialised snapshots yet)</w:t>
+            </w:r>
+          </w:p>
+        </w:tc>
+        <w:tc>
+          <w:tcPr/>
+          <w:p>
+            <w:pPr>
+              <w:pStyle w:val="Compact"/>
+            </w:pPr>
+            <w:r>
+              <w:t xml:space="preserve">Simpler correctness story; ledgers are small at current scale</w:t>
+            </w:r>
+          </w:p>
+        </w:tc>
+        <w:tc>
+          <w:tcPr/>
+          <w:p>
+            <w:pPr>
+              <w:pStyle w:val="Compact"/>
+            </w:pPr>
+            <w:r>
+              <w:t xml:space="preserve">Recompute cost grows with ledger size; materialise (per ADR-2) when profiling demands it.</w:t>
+            </w:r>
+          </w:p>
+        </w:tc>
+      </w:tr>
     </w:tbl>
     <w:p>
       <w:r>
@@ -5717,8 +6941,8 @@
         </w:pict>
       </w:r>
     </w:p>
-    <w:bookmarkEnd w:id="41"/>
-    <w:bookmarkStart w:id="42" w:name="X28cc5eddec27d29677b1c9e207742dc5a643033"/>
+    <w:bookmarkEnd w:id="42"/>
+    <w:bookmarkStart w:id="43" w:name="X28cc5eddec27d29677b1c9e207742dc5a643033"/>
     <w:p>
       <w:pPr>
         <w:pStyle w:val="Heading2"/>
@@ -5746,7 +6970,17 @@
         <w:t xml:space="preserve"> </w:t>
       </w:r>
       <w:r>
-        <w:t xml:space="preserve">Identity, Entity, CapTable, Document+e-Sign, DataRoom, Compliance (calendar + ROC/FEMA basics), Portal (basic), Workflow engine, Workspace/dashboard — i.e., the relational core + workflow backbone + startup happy path.</w:t>
+        <w:t xml:space="preserve">Identity, Entity, CapTable, Document+e-Sign, DataRoom, Compliance (calendar + ROC/FEMA basics), Portal (basic), Workflow engine, Workspace/dashboard.</w:t>
+      </w:r>
+      <w:r>
+        <w:t xml:space="preserve"> </w:t>
+      </w:r>
+      <w:r>
+        <w:rPr>
+          <w:b/>
+          <w:bCs/>
+        </w:rPr>
+        <w:t xml:space="preserve">[Done]</w:t>
       </w:r>
     </w:p>
     <w:p>
@@ -5768,7 +7002,23 @@
         <w:t xml:space="preserve"> </w:t>
       </w:r>
       <w:r>
-        <w:t xml:space="preserve">FundAdmin (AIF) + SPV, full ESOP, Fundraising compliance/closing automation, Valuation workflows, full Governance, Services marketplace, Managed Admin, CLM, Team, payments/accounting integrations.</w:t>
+        <w:t xml:space="preserve">FundAdmin (AIF) + SPV, full ESOP, Fundraising compliance/closing automation, Valuation workflows, full Governance, Services marketplace, Managed Admin, CLM, Team.</w:t>
+      </w:r>
+      <w:r>
+        <w:t xml:space="preserve"> </w:t>
+      </w:r>
+      <w:r>
+        <w:rPr>
+          <w:b/>
+          <w:bCs/>
+        </w:rPr>
+        <w:t xml:space="preserve">[Done functionally]</w:t>
+      </w:r>
+      <w:r>
+        <w:t xml:space="preserve"> </w:t>
+      </w:r>
+      <w:r>
+        <w:t xml:space="preserve">— payments/accounting integrations remain credential-blocked.</w:t>
       </w:r>
     </w:p>
     <w:p>
@@ -5790,7 +7040,55 @@
         <w:t xml:space="preserve"> </w:t>
       </w:r>
       <w:r>
-        <w:t xml:space="preserve">Secondaries, AI drafting/review, custom &amp; analytics workflows, public API/webhooks, deeper portal, multi-language.</w:t>
+        <w:t xml:space="preserve">Secondaries</w:t>
+      </w:r>
+      <w:r>
+        <w:t xml:space="preserve"> </w:t>
+      </w:r>
+      <w:r>
+        <w:rPr>
+          <w:b/>
+          <w:bCs/>
+        </w:rPr>
+        <w:t xml:space="preserve">[ROFR flow done]</w:t>
+      </w:r>
+      <w:r>
+        <w:t xml:space="preserve">, AI drafting/review, custom &amp; analytics workflows, public API/webhooks, deeper portal</w:t>
+      </w:r>
+      <w:r>
+        <w:t xml:space="preserve"> </w:t>
+      </w:r>
+      <w:r>
+        <w:rPr>
+          <w:b/>
+          <w:bCs/>
+        </w:rPr>
+        <w:t xml:space="preserve">[consents, statements, tax forms, performance done]</w:t>
+      </w:r>
+      <w:r>
+        <w:t xml:space="preserve">, multi-language.</w:t>
+      </w:r>
+    </w:p>
+    <w:p>
+      <w:pPr>
+        <w:pStyle w:val="Compact"/>
+        <w:numPr>
+          <w:ilvl w:val="0"/>
+          <w:numId w:val="1010"/>
+        </w:numPr>
+      </w:pPr>
+      <w:r>
+        <w:rPr>
+          <w:b/>
+          <w:bCs/>
+        </w:rPr>
+        <w:t xml:space="preserve">Current frontier (Phase 3.5, per REQUIREMENTS §9):</w:t>
+      </w:r>
+      <w:r>
+        <w:t xml:space="preserve"> </w:t>
+      </w:r>
+      <w:r>
+        <w:t xml:space="preserve">deployment (Cloud SQL + RLS + Cloud Run), email delivery + production auth, PDF rendering, cap-table import, then credentialed integrations.</w:t>
       </w:r>
     </w:p>
     <w:p>
@@ -5798,7 +7096,7 @@
         <w:pStyle w:val="FirstParagraph"/>
       </w:pPr>
       <w:r>
-        <w:t xml:space="preserve">Non-functional requirements (NFR-1..11) are satisfied by §6 (data/multi-tenancy/ledger), §10 (security/privacy/residency/audit), §11 (availability/deployment), and §12 (cross-cutting).</w:t>
+        <w:t xml:space="preserve">Non-functional requirements (NFR-1..13) are satisfied by §6 (data/multi-tenancy/ledger/migrations), §10 (security/privacy/residency/audit), §11 (availability/deployment), §12 (cross-cutting), and ADR-8 (uniform IST clock).</w:t>
       </w:r>
     </w:p>
     <w:p>
@@ -5808,8 +7106,8 @@
         </w:pict>
       </w:r>
     </w:p>
-    <w:bookmarkEnd w:id="42"/>
-    <w:bookmarkStart w:id="43" w:name="Xe1068b0c1fdc25d8d1f71e8c3e1c59115dc2dee"/>
+    <w:bookmarkEnd w:id="43"/>
+    <w:bookmarkStart w:id="44" w:name="Xe1068b0c1fdc25d8d1f71e8c3e1c59115dc2dee"/>
     <w:p>
       <w:pPr>
         <w:pStyle w:val="Heading2"/>
@@ -5969,6 +7267,475 @@
         </w:pict>
       </w:r>
     </w:p>
+    <w:bookmarkEnd w:id="44"/>
+    <w:bookmarkStart w:id="45" w:name="Xc29bb3d8ee824a656bb48bd55d695c1dd9f9627"/>
+    <w:p>
+      <w:pPr>
+        <w:pStyle w:val="Heading2"/>
+      </w:pPr>
+      <w:r>
+        <w:t xml:space="preserve">16. As-Built Addendum (v1.0, 2026-07-14)</w:t>
+      </w:r>
+    </w:p>
+    <w:p>
+      <w:pPr>
+        <w:pStyle w:val="FirstParagraph"/>
+      </w:pPr>
+      <w:r>
+        <w:t xml:space="preserve">A condensed map of the implementation for engineers joining the codebase.</w:t>
+      </w:r>
+    </w:p>
+    <w:p>
+      <w:pPr>
+        <w:pStyle w:val="BodyText"/>
+      </w:pPr>
+      <w:r>
+        <w:rPr>
+          <w:b/>
+          <w:bCs/>
+        </w:rPr>
+        <w:t xml:space="preserve">Backend (</w:t>
+      </w:r>
+      <w:r>
+        <w:rPr>
+          <w:rStyle w:val="VerbatimChar"/>
+          <w:b/>
+          <w:bCs/>
+        </w:rPr>
+        <w:t xml:space="preserve">apps/api</w:t>
+      </w:r>
+      <w:r>
+        <w:rPr>
+          <w:b/>
+          <w:bCs/>
+        </w:rPr>
+        <w:t xml:space="preserve">)</w:t>
+      </w:r>
+      <w:r>
+        <w:t xml:space="preserve"> </w:t>
+      </w:r>
+      <w:r>
+        <w:t xml:space="preserve">— FastAPI + SQLAlchemy 2.0; 71 tables across 21 bounded contexts; 174 pytest tests (</w:t>
+      </w:r>
+      <w:r>
+        <w:rPr>
+          <w:rStyle w:val="VerbatimChar"/>
+        </w:rPr>
+        <w:t xml:space="preserve">tests/test_journey.py</w:t>
+      </w:r>
+      <w:r>
+        <w:t xml:space="preserve"> </w:t>
+      </w:r>
+      <w:r>
+        <w:t xml:space="preserve">walks the full founder ladder end-to-end). Notable machinery:</w:t>
+      </w:r>
+    </w:p>
+    <w:p>
+      <w:pPr>
+        <w:pStyle w:val="Compact"/>
+        <w:numPr>
+          <w:ilvl w:val="0"/>
+          <w:numId w:val="1012"/>
+        </w:numPr>
+      </w:pPr>
+      <w:r>
+        <w:rPr>
+          <w:rStyle w:val="VerbatimChar"/>
+        </w:rPr>
+        <w:t xml:space="preserve">app/deps.py</w:t>
+      </w:r>
+      <w:r>
+        <w:t xml:space="preserve"> </w:t>
+      </w:r>
+      <w:r>
+        <w:t xml:space="preserve">— a factory generates the (Ctx, dependency) pair for every entity-owned resource (ownership resolution + tenant role via a synthesized signature);</w:t>
+      </w:r>
+      <w:r>
+        <w:t xml:space="preserve"> </w:t>
+      </w:r>
+      <w:r>
+        <w:rPr>
+          <w:rStyle w:val="VerbatimChar"/>
+        </w:rPr>
+        <w:t xml:space="preserve">get_owned</w:t>
+      </w:r>
+      <w:r>
+        <w:t xml:space="preserve"> </w:t>
+      </w:r>
+      <w:r>
+        <w:t xml:space="preserve">guards body-referenced ids.</w:t>
+      </w:r>
+    </w:p>
+    <w:p>
+      <w:pPr>
+        <w:pStyle w:val="Compact"/>
+        <w:numPr>
+          <w:ilvl w:val="0"/>
+          <w:numId w:val="1012"/>
+        </w:numPr>
+      </w:pPr>
+      <w:r>
+        <w:rPr>
+          <w:rStyle w:val="VerbatimChar"/>
+        </w:rPr>
+        <w:t xml:space="preserve">app/clock.py</w:t>
+      </w:r>
+      <w:r>
+        <w:t xml:space="preserve"> </w:t>
+      </w:r>
+      <w:r>
+        <w:t xml:space="preserve">— the IST platform clock (ADR-8);</w:t>
+      </w:r>
+      <w:r>
+        <w:t xml:space="preserve"> </w:t>
+      </w:r>
+      <w:r>
+        <w:rPr>
+          <w:rStyle w:val="VerbatimChar"/>
+        </w:rPr>
+        <w:t xml:space="preserve">app/middleware.py</w:t>
+      </w:r>
+      <w:r>
+        <w:t xml:space="preserve"> </w:t>
+      </w:r>
+      <w:r>
+        <w:t xml:space="preserve">— audit log of every mutating request;</w:t>
+      </w:r>
+      <w:r>
+        <w:t xml:space="preserve"> </w:t>
+      </w:r>
+      <w:r>
+        <w:rPr>
+          <w:rStyle w:val="VerbatimChar"/>
+        </w:rPr>
+        <w:t xml:space="preserve">app/ratelimit.py</w:t>
+      </w:r>
+      <w:r>
+        <w:t xml:space="preserve"> </w:t>
+      </w:r>
+      <w:r>
+        <w:t xml:space="preserve">— login failure limiter.</w:t>
+      </w:r>
+    </w:p>
+    <w:p>
+      <w:pPr>
+        <w:pStyle w:val="Compact"/>
+        <w:numPr>
+          <w:ilvl w:val="0"/>
+          <w:numId w:val="1012"/>
+        </w:numPr>
+      </w:pPr>
+      <w:r>
+        <w:rPr>
+          <w:rStyle w:val="VerbatimChar"/>
+        </w:rPr>
+        <w:t xml:space="preserve">app/services/captable.py</w:t>
+      </w:r>
+      <w:r>
+        <w:t xml:space="preserve"> </w:t>
+      </w:r>
+      <w:r>
+        <w:t xml:space="preserve">— the event-replay projection (cost basis follows shares) feeding cap table, waterfall, holdings validation;</w:t>
+      </w:r>
+      <w:r>
+        <w:t xml:space="preserve"> </w:t>
+      </w:r>
+      <w:r>
+        <w:rPr>
+          <w:rStyle w:val="VerbatimChar"/>
+        </w:rPr>
+        <w:t xml:space="preserve">services/diluted.py</w:t>
+      </w:r>
+      <w:r>
+        <w:t xml:space="preserve"> </w:t>
+      </w:r>
+      <w:r>
+        <w:t xml:space="preserve">— fully-diluted + anti-dilution;</w:t>
+      </w:r>
+      <w:r>
+        <w:t xml:space="preserve"> </w:t>
+      </w:r>
+      <w:r>
+        <w:rPr>
+          <w:rStyle w:val="VerbatimChar"/>
+        </w:rPr>
+        <w:t xml:space="preserve">services/placement.py</w:t>
+      </w:r>
+      <w:r>
+        <w:t xml:space="preserve"> </w:t>
+      </w:r>
+      <w:r>
+        <w:t xml:space="preserve">— Sec 42 offeree cap.</w:t>
+      </w:r>
+    </w:p>
+    <w:p>
+      <w:pPr>
+        <w:pStyle w:val="Compact"/>
+        <w:numPr>
+          <w:ilvl w:val="0"/>
+          <w:numId w:val="1012"/>
+        </w:numPr>
+      </w:pPr>
+      <w:r>
+        <w:rPr>
+          <w:rStyle w:val="VerbatimChar"/>
+        </w:rPr>
+        <w:t xml:space="preserve">app/services/fund.py</w:t>
+      </w:r>
+      <w:r>
+        <w:t xml:space="preserve"> </w:t>
+      </w:r>
+      <w:r>
+        <w:t xml:space="preserve">+</w:t>
+      </w:r>
+      <w:r>
+        <w:t xml:space="preserve"> </w:t>
+      </w:r>
+      <w:r>
+        <w:rPr>
+          <w:rStyle w:val="VerbatimChar"/>
+        </w:rPr>
+        <w:t xml:space="preserve">fund_perf.py</w:t>
+      </w:r>
+      <w:r>
+        <w:t xml:space="preserve"> </w:t>
+      </w:r>
+      <w:r>
+        <w:t xml:space="preserve">— capital accounts, European waterfall (ROC → hurdle → catch-up → carry), fee accrual/charging, ₹10-par units, DPI/RVPI/TVPI/XIRR.</w:t>
+      </w:r>
+    </w:p>
+    <w:p>
+      <w:pPr>
+        <w:pStyle w:val="Compact"/>
+        <w:numPr>
+          <w:ilvl w:val="0"/>
+          <w:numId w:val="1012"/>
+        </w:numPr>
+      </w:pPr>
+      <w:r>
+        <w:rPr>
+          <w:rStyle w:val="VerbatimChar"/>
+        </w:rPr>
+        <w:t xml:space="preserve">app/services/round.py</w:t>
+      </w:r>
+      <w:r>
+        <w:t xml:space="preserve"> </w:t>
+      </w:r>
+      <w:r>
+        <w:t xml:space="preserve">— round close converts outstanding SAFEs/notes automatically (pre-money cap basis) before allotments and injects PAS-3/FC-GPR.</w:t>
+      </w:r>
+    </w:p>
+    <w:p>
+      <w:pPr>
+        <w:pStyle w:val="Compact"/>
+        <w:numPr>
+          <w:ilvl w:val="0"/>
+          <w:numId w:val="1012"/>
+        </w:numPr>
+      </w:pPr>
+      <w:r>
+        <w:rPr>
+          <w:rStyle w:val="VerbatimChar"/>
+        </w:rPr>
+        <w:t xml:space="preserve">app/stages.py</w:t>
+      </w:r>
+      <w:r>
+        <w:t xml:space="preserve"> </w:t>
+      </w:r>
+      <w:r>
+        <w:t xml:space="preserve">+</w:t>
+      </w:r>
+      <w:r>
+        <w:t xml:space="preserve"> </w:t>
+      </w:r>
+      <w:r>
+        <w:rPr>
+          <w:rStyle w:val="VerbatimChar"/>
+        </w:rPr>
+        <w:t xml:space="preserve">services/stage.py</w:t>
+      </w:r>
+      <w:r>
+        <w:t xml:space="preserve"> </w:t>
+      </w:r>
+      <w:r>
+        <w:t xml:space="preserve">— lifecycle stages (inception → pre-seed → seed → series → pre-IPO) with data-driven checklists, tab/feature gating, and stage suggestion.</w:t>
+      </w:r>
+    </w:p>
+    <w:p>
+      <w:pPr>
+        <w:pStyle w:val="Compact"/>
+        <w:numPr>
+          <w:ilvl w:val="0"/>
+          <w:numId w:val="1012"/>
+        </w:numPr>
+      </w:pPr>
+      <w:r>
+        <w:t xml:space="preserve">Rules-as-data registries: compliance (</w:t>
+      </w:r>
+      <w:r>
+        <w:rPr>
+          <w:rStyle w:val="VerbatimChar"/>
+        </w:rPr>
+        <w:t xml:space="preserve">app/compliance/rules.py</w:t>
+      </w:r>
+      <w:r>
+        <w:t xml:space="preserve">), templates (</w:t>
+      </w:r>
+      <w:r>
+        <w:rPr>
+          <w:rStyle w:val="VerbatimChar"/>
+        </w:rPr>
+        <w:t xml:space="preserve">app/documents/templates.py</w:t>
+      </w:r>
+      <w:r>
+        <w:t xml:space="preserve">), workflows (</w:t>
+      </w:r>
+      <w:r>
+        <w:rPr>
+          <w:rStyle w:val="VerbatimChar"/>
+        </w:rPr>
+        <w:t xml:space="preserve">app/workflows/registry.py</w:t>
+      </w:r>
+      <w:r>
+        <w:t xml:space="preserve">).</w:t>
+      </w:r>
+    </w:p>
+    <w:p>
+      <w:pPr>
+        <w:pStyle w:val="FirstParagraph"/>
+      </w:pPr>
+      <w:r>
+        <w:rPr>
+          <w:b/>
+          <w:bCs/>
+        </w:rPr>
+        <w:t xml:space="preserve">Frontend (</w:t>
+      </w:r>
+      <w:r>
+        <w:rPr>
+          <w:rStyle w:val="VerbatimChar"/>
+          <w:b/>
+          <w:bCs/>
+        </w:rPr>
+        <w:t xml:space="preserve">apps/web</w:t>
+      </w:r>
+      <w:r>
+        <w:rPr>
+          <w:b/>
+          <w:bCs/>
+        </w:rPr>
+        <w:t xml:space="preserve">)</w:t>
+      </w:r>
+      <w:r>
+        <w:t xml:space="preserve"> </w:t>
+      </w:r>
+      <w:r>
+        <w:t xml:space="preserve">— React 18 + Vite + TS; typed fetch client (</w:t>
+      </w:r>
+      <w:r>
+        <w:rPr>
+          <w:rStyle w:val="VerbatimChar"/>
+        </w:rPr>
+        <w:t xml:space="preserve">src/api.ts</w:t>
+      </w:r>
+      <w:r>
+        <w:t xml:space="preserve">); grouped two-level navigation with stage-filtered tabs (</w:t>
+      </w:r>
+      <w:r>
+        <w:rPr>
+          <w:rStyle w:val="VerbatimChar"/>
+        </w:rPr>
+        <w:t xml:space="preserve">pages/EntityDetail.tsx</w:t>
+      </w:r>
+      <w:r>
+        <w:t xml:space="preserve">); feature components per module under</w:t>
+      </w:r>
+      <w:r>
+        <w:t xml:space="preserve"> </w:t>
+      </w:r>
+      <w:r>
+        <w:rPr>
+          <w:rStyle w:val="VerbatimChar"/>
+        </w:rPr>
+        <w:t xml:space="preserve">src/features/</w:t>
+      </w:r>
+      <w:r>
+        <w:t xml:space="preserve">; investor/LP/employee portal (</w:t>
+      </w:r>
+      <w:r>
+        <w:rPr>
+          <w:rStyle w:val="VerbatimChar"/>
+        </w:rPr>
+        <w:t xml:space="preserve">pages/Portal.tsx</w:t>
+      </w:r>
+      <w:r>
+        <w:t xml:space="preserve">) with consents, sale requests, statements and tax forms; vitest suite.</w:t>
+      </w:r>
+    </w:p>
+    <w:p>
+      <w:pPr>
+        <w:pStyle w:val="BodyText"/>
+      </w:pPr>
+      <w:r>
+        <w:rPr>
+          <w:b/>
+          <w:bCs/>
+        </w:rPr>
+        <w:t xml:space="preserve">Operational state</w:t>
+      </w:r>
+      <w:r>
+        <w:t xml:space="preserve"> </w:t>
+      </w:r>
+      <w:r>
+        <w:t xml:space="preserve">— CI on GitHub Actions; Alembic chain verified for model parity; demo workspace seeded by</w:t>
+      </w:r>
+      <w:r>
+        <w:t xml:space="preserve"> </w:t>
+      </w:r>
+      <w:r>
+        <w:rPr>
+          <w:rStyle w:val="VerbatimChar"/>
+        </w:rPr>
+        <w:t xml:space="preserve">apps/api/scripts/seed_demo.py --fresh</w:t>
+      </w:r>
+      <w:r>
+        <w:t xml:space="preserve"> </w:t>
+      </w:r>
+      <w:r>
+        <w:t xml:space="preserve">(login</w:t>
+      </w:r>
+      <w:r>
+        <w:t xml:space="preserve"> </w:t>
+      </w:r>
+      <w:r>
+        <w:rPr>
+          <w:rStyle w:val="VerbatimChar"/>
+        </w:rPr>
+        <w:t xml:space="preserve">demo@acme.in</w:t>
+      </w:r>
+      <w:r>
+        <w:t xml:space="preserve">); deployment deferred per</w:t>
+      </w:r>
+      <w:r>
+        <w:t xml:space="preserve"> </w:t>
+      </w:r>
+      <w:r>
+        <w:rPr>
+          <w:rStyle w:val="VerbatimChar"/>
+        </w:rPr>
+        <w:t xml:space="preserve">DEPLOYMENT.md</w:t>
+      </w:r>
+      <w:r>
+        <w:t xml:space="preserve">.</w:t>
+      </w:r>
+    </w:p>
+    <w:p>
+      <w:r>
+        <w:pict>
+          <v:rect style="width:0;height:1.5pt" o:hralign="center" o:hrstd="t" o:hr="t"/>
+        </w:pict>
+      </w:r>
+    </w:p>
     <w:p>
       <w:pPr>
         <w:pStyle w:val="FirstParagraph"/>
@@ -5978,7 +7745,7 @@
           <w:i/>
           <w:iCs/>
         </w:rPr>
-        <w:t xml:space="preserve">Companion document: see</w:t>
+        <w:t xml:space="preserve">Companion documents:</w:t>
       </w:r>
       <w:r>
         <w:rPr>
@@ -6007,11 +7774,40 @@
           <w:i/>
           <w:iCs/>
         </w:rPr>
-        <w:t xml:space="preserve">for full functional/non-functional requirements and the conceptual data model.</w:t>
-      </w:r>
-    </w:p>
-    <w:bookmarkEnd w:id="43"/>
-    <w:bookmarkEnd w:id="44"/>
+        <w:t xml:space="preserve">(functional/non-functional requirements, conceptual data model, per-FR status) and</w:t>
+      </w:r>
+      <w:r>
+        <w:rPr>
+          <w:i/>
+          <w:iCs/>
+        </w:rPr>
+        <w:t xml:space="preserve"> </w:t>
+      </w:r>
+      <w:r>
+        <w:rPr>
+          <w:rStyle w:val="VerbatimChar"/>
+          <w:i/>
+          <w:iCs/>
+        </w:rPr>
+        <w:t xml:space="preserve">DEPLOYMENT.md</w:t>
+      </w:r>
+      <w:r>
+        <w:rPr>
+          <w:i/>
+          <w:iCs/>
+        </w:rPr>
+        <w:t xml:space="preserve"> </w:t>
+      </w:r>
+      <w:r>
+        <w:rPr>
+          <w:i/>
+          <w:iCs/>
+        </w:rPr>
+        <w:t xml:space="preserve">(deferred infra plan).</w:t>
+      </w:r>
+    </w:p>
+    <w:bookmarkEnd w:id="45"/>
+    <w:bookmarkEnd w:id="46"/>
     <w:sectPr>
       <w:footnotePr>
         <w:numRestart w:val="eachSect"/>
@@ -6426,6 +8222,9 @@
     <w:lvlOverride w:ilvl="8">
       <w:startOverride w:val="1"/>
     </w:lvlOverride>
+  </w:num>
+  <w:num w:numId="1012">
+    <w:abstractNumId w:val="991"/>
   </w:num>
 </w:numbering>
 </file>

</xml_diff>